<commit_message>
Clarify test scenarios in report section 3
</commit_message>
<xml_diff>
--- a/docs/results/report.docx
+++ b/docs/results/report.docx
@@ -56,7 +56,7 @@
     </w:p>
     <w:p>
       <w:r>
-        <w:t>Проверить создание бронирования на свободное время, повторную заявку на занятый интервал и отмену бронирования. Ожидаемые ответы системы и конкретные интервалы времени нужно уточнить перед выполнением проверки.</w:t>
+        <w:t>Для примера считаем, что аудитория А занята с 10:00 до 11:00. Заявка на 11:00–12:00 должна быть принята: соседние интервалы не пересекаются. Заявка на 10:30–11:30 должна быть отклонена с указанием конфликта. После отмены бронирования на 10:00–11:00 новая заявка на это время должна быть принята. Это ожидаемые ответы; фактическое выполнение сценариев и результаты нужно зафиксировать отдельно.</w:t>
       </w:r>
     </w:p>
     <w:p>
@@ -69,7 +69,7 @@
     </w:p>
     <w:p>
       <w:r>
-        <w:t>В примере нет интеграции с университетской системой и реальных персональных данных. Следующий шаг — уточнить проверяемые сценарии в разделе 3, затем подготовить демонстрацию и описание полученных результатов.</w:t>
+        <w:t>В примере нет интеграции с университетской системой и реальных персональных данных. Следующий шаг — выполнить сценарии из раздела 3, затем подготовить демонстрацию и описание полученных результатов.</w:t>
       </w:r>
     </w:p>
     <w:sectPr>

</xml_diff>